<commit_message>
Preserve assurance appendix scope in HKEX example
</commit_message>
<xml_diff>
--- a/examples/hkex-2025/deliverables/report.docx
+++ b/examples/hkex-2025/deliverables/report.docx
@@ -17,6 +17,11 @@
     </w:p>
     <w:p>
       <w:r>
+        <w:t>对象：香港交易及结算所有限公司。范围：consolidated。会计基础：HKFRS。</w:t>
+      </w:r>
+    </w:p>
+    <w:p>
+      <w:r>
         <w:t>公开年报会计分析示例；供专业研究复核，不是审计意见或完整监管压力验证</w:t>
       </w:r>
     </w:p>
@@ -30,22 +35,22 @@
     </w:p>
     <w:p>
       <w:r>
-        <w:t>营业收入同比36.89%，集团净利润同比35.59%。营业收入增量6,399.00 HKD × 1000000占收入及其他收益增量的94.28%；现金分部占公司定义EBITDA增量80.26%。 [f_business; e_profit, e_business]</w:t>
+        <w:t>[supported] 营业收入同比36.89%，集团净利润同比35.59%。营业收入增量6,399.00 百万HKD占收入及其他收益增量的94.28%；现金分部占公司定义EBITDA增量80.26%。 [f_business; e_profit, e_business]</w:t>
       </w:r>
     </w:p>
     <w:p>
       <w:r>
-        <w:t>逐行桥得到主要经营现金19,855.00 HKD × 1000000、HKAS7 CFO25,627.00 HKD × 1000000；其中外部基金赎回为5,772.00 HKD × 1000000。现金流量表现金19,353.00 HKD × 1000000与资产负债表现金182,724.00 HKD × 1000000是不同范围。 [f_cash; e_cf, e_cash, e_margin]</w:t>
+        <w:t>[supported] 逐行桥得到主要经营现金19,855.00 百万HKD、HKAS7 CFO25,627.00 百万HKD；其中外部基金赎回为5,772.00 百万HKD。现金流量表现金19,353.00 百万HKD与资产负债表现金182,724.00 百万HKD是不同范围。 [f_cash; e_cf, e_cash, e_margin]</w:t>
       </w:r>
     </w:p>
     <w:p>
       <w:r>
-        <w:t>保证金资产重建269,243.00 HKD × 1000000对应义务269,243.00 HKD × 1000000；清算基金净资产35,796.00 HKD × 1000000与披露一致。 [f_fmi; e_margin, e_cash]</w:t>
+        <w:t>[conditional] 保证金资产重建269,243.00 百万HKD对应义务269,243.00 百万HKD；清算基金净资产35,796.00 百万HKD与披露一致。 [f_fmi; e_margin, e_cash]</w:t>
       </w:r>
     </w:p>
     <w:p>
       <w:r>
-        <w:t>范围：consolidated。会计基础：HKFRS。</w:t>
+        <w:t>方法与适用范围：SKILL、analysis-program、accounting-and-audit、financial-institutions、workpaper契约</w:t>
       </w:r>
     </w:p>
     <w:p>
@@ -65,7 +70,7 @@
     </w:p>
     <w:p>
       <w:r>
-        <w:t>已取得FCA最终文书及独立可持续报告，并定向核读风险、治理及有限保证范围；未执行网络、气候模型或整改运行测试。</w:t>
+        <w:t>已取得FCA最终文书及独立可持续报告，并接读保证声明并入的附录A；HKQAA有限保证不评价ESG政策执行有效性或全面模型适当性。本次未执行网络、气候模型或整改运行测试。</w:t>
       </w:r>
     </w:p>
     <w:p>
@@ -267,12 +272,12 @@
         <w:pStyle w:val="Heading2"/>
       </w:pPr>
       <w:r>
-        <w:t>增长主要来自收费业务，现金市场贡献集中 [f_business]</w:t>
+        <w:t>增长主要来自收费业务，现金市场贡献集中 [f_business; supported]</w:t>
       </w:r>
     </w:p>
     <w:p>
       <w:r>
-        <w:t>营业收入同比36.89%，集团净利润同比35.59%。营业收入增量6,399.00 HKD × 1000000占收入及其他收益增量的94.28%；现金分部占公司定义EBITDA增量80.26%。</w:t>
+        <w:t>营业收入同比36.89%，集团净利润同比35.59%。营业收入增量6,399.00 百万HKD占收入及其他收益增量的94.28%；现金分部占公司定义EBITDA增量80.26%。</w:t>
       </w:r>
     </w:p>
     <w:p>
@@ -398,7 +403,7 @@
             <w:r>
               <w:t>2025-12-31</w:t>
               <w:br/>
-              <w:t>19,855.00 HKD × 1000000</w:t>
+              <w:t>19,855.00 百万HKD</w:t>
             </w:r>
           </w:p>
         </w:tc>
@@ -435,7 +440,7 @@
             <w:r>
               <w:t>2025-12-31</w:t>
               <w:br/>
-              <w:t>25,627.00 HKD × 1000000</w:t>
+              <w:t>25,627.00 百万HKD</w:t>
             </w:r>
           </w:p>
         </w:tc>
@@ -472,7 +477,7 @@
             <w:r>
               <w:t>2025-12-31</w:t>
               <w:br/>
-              <w:t>19,353.00 HKD × 1000000</w:t>
+              <w:t>19,353.00 百万HKD</w:t>
             </w:r>
           </w:p>
         </w:tc>
@@ -494,12 +499,12 @@
         <w:pStyle w:val="Heading2"/>
       </w:pPr>
       <w:r>
-        <w:t>利润有现金支持，但投资赎回不可当新增经营盈利 [f_cash]</w:t>
+        <w:t>利润有现金支持，但投资赎回不可当新增经营盈利 [f_cash; supported]</w:t>
       </w:r>
     </w:p>
     <w:p>
       <w:r>
-        <w:t>逐行桥得到主要经营现金19,855.00 HKD × 1000000、HKAS7 CFO25,627.00 HKD × 1000000；其中外部基金赎回为5,772.00 HKD × 1000000。现金流量表现金19,353.00 HKD × 1000000与资产负债表现金182,724.00 HKD × 1000000是不同范围。</w:t>
+        <w:t>逐行桥得到主要经营现金19,855.00 百万HKD、HKAS7 CFO25,627.00 百万HKD；其中外部基金赎回为5,772.00 百万HKD。现金流量表现金19,353.00 百万HKD与资产负债表现金182,724.00 百万HKD是不同范围。</w:t>
       </w:r>
     </w:p>
     <w:p>
@@ -625,7 +630,7 @@
             <w:r>
               <w:t>2025-12-31</w:t>
               <w:br/>
-              <w:t>269,243.00 HKD × 1000000</w:t>
+              <w:t>269,243.00 百万HKD</w:t>
             </w:r>
           </w:p>
         </w:tc>
@@ -662,7 +667,7 @@
             <w:r>
               <w:t>2025-12-31</w:t>
               <w:br/>
-              <w:t>35,796.00 HKD × 1000000</w:t>
+              <w:t>35,796.00 百万HKD</w:t>
             </w:r>
           </w:p>
         </w:tc>
@@ -684,12 +689,12 @@
         <w:pStyle w:val="Heading2"/>
       </w:pPr>
       <w:r>
-        <w:t>保证金资产与义务对齐，但不是压力安全证明 [f_fmi]</w:t>
+        <w:t>保证金资产与义务对齐，但不是压力安全证明 [f_fmi; conditional]</w:t>
       </w:r>
     </w:p>
     <w:p>
       <w:r>
-        <w:t>保证金资产重建269,243.00 HKD × 1000000对应义务269,243.00 HKD × 1000000；清算基金净资产35,796.00 HKD × 1000000与披露一致。</w:t>
+        <w:t>保证金资产重建269,243.00 百万HKD对应义务269,243.00 百万HKD；清算基金净资产35,796.00 百万HKD与披露一致。</w:t>
       </w:r>
     </w:p>
     <w:p>
@@ -815,7 +820,7 @@
             <w:r>
               <w:t>2025-12-31</w:t>
               <w:br/>
-              <w:t>58,729.00 HKD × 1000000</w:t>
+              <w:t>58,729.00 百万HKD</w:t>
             </w:r>
           </w:p>
         </w:tc>
@@ -852,7 +857,7 @@
             <w:r>
               <w:t>2025-12-31</w:t>
               <w:br/>
-              <w:t>398.00 HKD × 1000000</w:t>
+              <w:t>398.00 百万HKD</w:t>
             </w:r>
           </w:p>
         </w:tc>
@@ -874,17 +879,17 @@
         <w:pStyle w:val="Heading2"/>
       </w:pPr>
       <w:r>
-        <w:t>非控股看跌期权连接权益与债务现金 [f_equity]</w:t>
+        <w:t>非控股看跌期权连接权益与债务现金 [f_equity; supported]</w:t>
       </w:r>
     </w:p>
     <w:p>
       <w:r>
-        <w:t>全权益滚动58,729.00 HKD × 1000000、资产负债差58,729.00 HKD × 1000000与集团权益58,729.00 HKD × 1000000一致；看跌期权债务重建398.00 HKD × 1000000。</w:t>
+        <w:t>全权益滚动58,729.00 百万HKD、资产负债差58,729.00 百万HKD与集团权益58,729.00 百万HKD一致；看跌期权债务重建398.00 百万HKD。</w:t>
       </w:r>
     </w:p>
     <w:p>
       <w:r>
-        <w:t>非控股分配59.00 HKD × 1000000现金流出同时降低看跌期权负债，并在权益内把NCI转至归母储备，集团权益该行净零。宣告分配与实付股息另列，避免把权益增减全部理解成现金。</w:t>
+        <w:t>非控股分配59.00 百万HKD现金流出同时降低看跌期权负债，并在权益内把NCI转至归母储备，集团权益该行净零。宣告分配与实付股息另列，避免把权益增减全部理解成现金。</w:t>
       </w:r>
     </w:p>
     <w:p>
@@ -1005,7 +1010,7 @@
             <w:r>
               <w:t>2025-12-31</w:t>
               <w:br/>
-              <w:t>13,274.00 HKD × 1000000</w:t>
+              <w:t>13,274.00 百万HKD</w:t>
             </w:r>
           </w:p>
         </w:tc>
@@ -1042,7 +1047,7 @@
             <w:r>
               <w:t>2025-12-31</w:t>
               <w:br/>
-              <w:t>4,341.00 HKD × 1000000</w:t>
+              <w:t>4,341.00 百万HKD</w:t>
             </w:r>
           </w:p>
         </w:tc>
@@ -1064,12 +1069,12 @@
         <w:pStyle w:val="Heading2"/>
       </w:pPr>
       <w:r>
-        <w:t>技术战略改变已传导至商誉减值 [f_estimate]</w:t>
+        <w:t>技术战略改变已传导至商誉减值 [f_estimate; conditional]</w:t>
       </w:r>
     </w:p>
     <w:p>
       <w:r>
-        <w:t>商誉重建13,274.00 HKD × 1000000，本年减值55.00 HKD × 1000000；软件净值重建4,341.00 HKD × 1000000。BayConnect协同预期下调已有会计后果，不能将减值全当无关紧要的非现金项目。</w:t>
+        <w:t>商誉重建13,274.00 百万HKD，本年减值55.00 百万HKD；软件净值重建4,341.00 百万HKD。BayConnect协同预期下调已有会计后果，不能将减值全当无关紧要的非现金项目。</w:t>
       </w:r>
     </w:p>
     <w:p>
@@ -1195,7 +1200,7 @@
             <w:r>
               <w:t>2025-12-31</w:t>
               <w:br/>
-              <w:t>14,974.00 HKD × 1000000</w:t>
+              <w:t>14,974.00 百万HKD</w:t>
             </w:r>
           </w:p>
         </w:tc>
@@ -1232,7 +1237,7 @@
             <w:r>
               <w:t>2025-12-31</w:t>
               <w:br/>
-              <w:t>1,252.00 HKD × 1000000</w:t>
+              <w:t>1,252.00 百万HKD</w:t>
             </w:r>
           </w:p>
         </w:tc>
@@ -1254,17 +1259,17 @@
         <w:pStyle w:val="Heading2"/>
       </w:pPr>
       <w:r>
-        <w:t>总部投资和高分配率需要按现金时点管理 [f_capital]</w:t>
+        <w:t>总部投资和高分配率需要按现金时点管理 [f_capital; conditional]</w:t>
       </w:r>
     </w:p>
     <w:p>
       <w:r>
-        <w:t>主要经营现金减总部和其他长期经营资产付款为14,974.00 HKD × 1000000，再减归母股息实付剩1,252.00 HKD × 1000000；尚有总部已签承诺3,424.00 HKD × 1000000及其他资本安排。</w:t>
+        <w:t>主要经营现金减总部和其他长期经营资产付款为14,974.00 百万HKD，再减归母股息实付剩1,252.00 百万HKD；尚有总部已签承诺3,424.00 百万HKD及其他资本安排。</w:t>
       </w:r>
     </w:p>
     <w:p>
       <w:r>
-        <w:t>该观察未扣联营投资、奖励股份、租赁和其他资金变动；总部ROU/固定资产确认与付款及未来承诺不同步，不能把会计新增当现金支出。母公司现金2,870.00 HKD × 1000000也不同于集团资金。</w:t>
+        <w:t>该观察未扣联营投资、奖励股份、租赁和其他资金变动；总部ROU/固定资产确认与付款及未来承诺不同步，不能把会计新增当现金支出。母公司现金2,870.00 百万HKD也不同于集团资金。</w:t>
       </w:r>
     </w:p>
     <w:p>
@@ -1444,12 +1449,12 @@
         <w:pStyle w:val="Heading2"/>
       </w:pPr>
       <w:r>
-        <w:t>税负上升部分抵消税前增长 [f_tax]</w:t>
+        <w:t>税负上升部分抵消税前增长 [f_tax; supported]</w:t>
       </w:r>
     </w:p>
     <w:p>
       <w:r>
-        <w:t>税前利润同比42.45%，净利润同比35.59%；本年有效税率15.70%。最低补足税701.00 HKD × 1000000占所得税费用增量43.19%。</w:t>
+        <w:t>税前利润同比42.45%，净利润同比35.59%；本年有效税率15.70%。最低补足税701.00 百万HKD占所得税费用增量43.19%。</w:t>
       </w:r>
     </w:p>
     <w:p>
@@ -1490,7 +1495,7 @@
         <w:pStyle w:val="Heading2"/>
       </w:pPr>
       <w:r>
-        <w:t>控制证据、治理陈述与未来列报变更要分清 [f_governance]</w:t>
+        <w:t>控制证据、治理陈述与未来列报变更要分清 [f_governance; conditional]</w:t>
       </w:r>
     </w:p>
     <w:p>
@@ -1536,17 +1541,17 @@
         <w:pStyle w:val="Heading2"/>
       </w:pPr>
       <w:r>
-        <w:t>技术与气候风险有执行和有限保证证据 [f_resilience]</w:t>
+        <w:t>技术与气候披露：执行实例与保证范围分列 [f_resilience; conditional]</w:t>
       </w:r>
     </w:p>
     <w:p>
       <w:r>
-        <w:t>补充公开报告已取得。风灾中交易结算正常、网络演练和第三方隐私复核为积极证据；极端天气和网络中断仍通过交易收入、清算付款及资产/运营成本传导。</w:t>
+        <w:t>补充公开报告已取得。风灾中交易结算正常、网络演练和第三方隐私复核为积极披露证据；极端天气和网络中断仍通过交易收入、清算付款及资产/运营成本传导。HKQAA有限保证不覆盖ESG执行有效性或全面模型适当性。</w:t>
       </w:r>
     </w:p>
     <w:p>
       <w:r>
-        <w:t>可持续报告已把场景连接站点、收入与费用，不能重复请求整份公开报告。其模型的企业表现和技术不变假设需要挑战；有限保证不替代本次关键系统运行和模型复算。</w:t>
+        <w:t>可持续报告已把场景连接站点、收入与费用，不能重复请求整份公开报告。附录A将保证限制为披露数据的转录或转换，排除ESG执行效果且不全面评价判断、假设及估计技术，不能凭该保证关闭运行或模型风险。本次也未测试关键系统或复算气候模型；企业表现和技术不变假设仍需挑战。</w:t>
       </w:r>
     </w:p>
     <w:p>
@@ -1670,7 +1675,7 @@
     </w:p>
     <w:p>
       <w:r>
-        <w:t>逐项执行：19,005.00 HKD × 1000000、19,855.00 HKD × 1000000、25,627.00 HKD × 1000000、19,353.00 HKD × 1000000</w:t>
+        <w:t>逐项执行：19,005.00 百万HKD、19,855.00 百万HKD、25,627.00 百万HKD、19,353.00 百万HKD</w:t>
       </w:r>
     </w:p>
     <w:p>
@@ -1698,7 +1703,7 @@
     </w:p>
     <w:p>
       <w:r>
-        <w:t>逐项执行：58,729.00 HKD × 1000000、398.00 HKD × 1000000、58,729.00 HKD × 1000000</w:t>
+        <w:t>逐项执行：58,729.00 百万HKD、398.00 百万HKD、58,729.00 百万HKD</w:t>
       </w:r>
     </w:p>
     <w:p>
@@ -1726,7 +1731,7 @@
     </w:p>
     <w:p>
       <w:r>
-        <w:t>逐项执行：13,274.00 HKD × 1000000、4,341.00 HKD × 1000000</w:t>
+        <w:t>逐项执行：13,274.00 百万HKD、4,341.00 百万HKD</w:t>
       </w:r>
     </w:p>
     <w:p>
@@ -1754,7 +1759,7 @@
     </w:p>
     <w:p>
       <w:r>
-        <w:t>逐项执行：269,243.00 HKD × 1000000、35,796.00 HKD × 1000000</w:t>
+        <w:t>逐项执行：269,243.00 百万HKD、35,796.00 百万HKD</w:t>
       </w:r>
     </w:p>
     <w:p>
@@ -1831,7 +1836,7 @@
     </w:p>
     <w:p>
       <w:r>
-        <w:t>影响：FCA最终文书及独立可持续报告已经取得，剩余是运行与模型证据；不再请求公开报告本身。。责任角色：技术风险与合规负责人。关闭条件：用具体运行样本、整改结果与模型数据更新判断；保留第三方有限保证的范围边界。</w:t>
+        <w:t>影响：FCA最终文书及独立可持续报告含保证附录已经取得；原保证不覆盖执行效果或全面模型适当性，剩余是具体运行与模型证据，不再请求公开报告本身。。责任角色：技术风险与合规负责人。关闭条件：用具体运行样本、整改结果与模型数据更新判断；保留第三方有限保证的范围边界。</w:t>
       </w:r>
     </w:p>
     <w:p>
@@ -1866,7 +1871,7 @@
         <w:br/>
         <w:t>https://www.hkexgroup.com/-/media/HKEX-Group-Site/ssd/Investor-Relations/Regulatory-Reports/documents/2026/260316sr_e.pdf</w:t>
         <w:br/>
-        <w:t>已取得76页原件；读取PDF42-43、56-58、71-72页，首次公告日未单独核验。</w:t>
+        <w:t>已取得76页原件；读取PDF42-43、56-58、71-74页，含保证声明及其明确并入的附录A；首次公告日未单独核验。</w:t>
       </w:r>
     </w:p>
     <w:p>
@@ -1886,7 +1891,7 @@
     </w:p>
     <w:p>
       <w:r>
-        <w:t>[e_cf] annual PDF物理页147、205。已视觉核对PDF205两列表头2025/2024及所有带符号行；2025税前21158，依次调整-5111,+94,-76,+96,+1568,+361,-26,+1,-80198,+80386,-7073,+6866,-374,-196,-145,-11679,+13353=19005，再+7519-4626-510-1533=19855。147页外部基金赎回5772，CFO25627，CFI-5565，CFF-14635，汇兑16；期初13910、期末19353。 原件公开披露；仅支持披露层结论，不是本次交易真实性或控制运行测试</w:t>
+        <w:t>[e_cf] annual PDF物理页147、205。已视觉核对PDF205两列表头2025/2024及所有带符号行；2025税前21158，依次调整‑5111,+94,‑76,+96,+1568,+361,‑26,+1,‑80198,+80386,‑7073,+6866,‑374,‑196,‑145,‑11679,+13353=19005，再+7519-4626-510-1533=19855。147页外部基金赎回5772，CFO25627，CFI-5565，CFF-14635，汇兑16；期初13910、期末19353。 原件公开披露；仅支持披露层结论，不是本次交易真实性或控制运行测试</w:t>
       </w:r>
     </w:p>
     <w:p>
@@ -1901,7 +1906,7 @@
     </w:p>
     <w:p>
       <w:r>
-        <w:t>[e_equity] annual PDF物理页145-146、194-195、206。PDF146完整表头视觉核对：2025最右Total equity列期初54407、净利润17837、OCI369；直接权益行-6193,-7583,+34,-512,vesting合计零,+361,+9,储备转拨合计零,NCI dividend合计零；期末58729。最后一行NCI分红归母储备+59、NCI-59，总权益零，现金和看跌期权负债减少59另在147/195/206反映。 原件公开披露；仅支持披露层结论，不是本次交易真实性或控制运行测试</w:t>
+        <w:t>[e_equity] annual PDF物理页145-146、194-195、206。PDF146完整表头视觉核对：2025最右Total equity列期初54407、净利润17837、OCI369；直接权益行‑6193,‑7583,+34,‑512,vesting合计零,+361,+9,储备转拨合计零,NCI dividend合计零；期末58729。最后一行NCI分红归母储备+59、NCI-59，总权益零，现金和看跌期权负债减少59另在147/195/206反映。 原件公开披露；仅支持披露层结论，不是本次交易真实性或控制运行测试</w:t>
       </w:r>
     </w:p>
     <w:p>
@@ -1941,7 +1946,7 @@
     </w:p>
     <w:p>
       <w:r>
-        <w:t>[e_sr] sr PDF42-43、56-58、71-72；印刷40-41、54-56、69-70。披露网络独立专家验证、数据中心ISO27001、定期演练、2025第三方隐私复核；风灾期间交易结算正常是正面执行实例。气候评估覆盖17个自有及租用站点，比较NGFS路径并连接交易收入、资产损害/能源成本；存在公司表现不变及技术不变等假设。HKQAA声明为ISAE3000有限保证，非本次网络运行或气候模型验证。 公司独立报告与第三方有限保证原件；管理层模型结果与保证范围均保留限制</w:t>
+        <w:t>[e_sr] sr PDF42-43、56-58、71-74；印刷40-41、54-56、69-72；保证声明及附录A。披露网络独立专家验证、数据中心ISO27001、定期演练、2025第三方隐私复核；风灾期间交易结算正常是正面执行实例。气候评估覆盖17个自有及租用站点，比较NGFS路径并连接交易收入、资产损害/能源成本；存在公司表现不变及技术不变等假设。HKQAA声明称程序参照ISAE3000，以有限保证评价2025年度披露是否按ESG Reporting Code编制，并参考GRI。正文明确并入附录A：范围限于数据向披露的转录或转换，不评价ESG政策及实践的执行或有效性，不全面评价管理层判断、假设或估计技术；报告期外信息排除。该保证不是本次网络运行或气候模型验证。 公司披露与HKQAA有限保证原件；外部保证依赖公司提供资料及系统/模型假设，不把公司演练实例当作保证方运行测试，亦不证明气候模型假设已获全面验证</w:t>
       </w:r>
     </w:p>
     <w:sectPr>

</xml_diff>